<commit_message>
weibull: reframe short communication around TB LTFU hazard-shape heterogeneity vs unified intervention (real-lit grounded, cause unknown)
Co-Authored-By: Tatsuki Onishi <bougtoir@gmail.com>
</commit_message>
<xml_diff>
--- a/weibull-clinical-dropout/reanalysis_real/manuscript/tb_dropout_heterogeneity_short_communication.docx
+++ b/weibull-clinical-dropout/reanalysis_real/manuscript/tb_dropout_heterogeneity_short_communication.docx
@@ -11,7 +11,7 @@
           <w:b/>
           <w:sz w:val="30"/>
         </w:rPr>
-        <w:t>Heterogeneous dropout-hazard shapes in tuberculosis treatment: a hypothesis-generating re-analysis of digitized survival curves</w:t>
+        <w:t>Divergent hazard shapes of tuberculosis treatment loss to follow-up: a reproducible re-analysis quantifying the heterogeneity that hinders a unified retention intervention</w:t>
       </w:r>
     </w:p>
     <w:p>
@@ -48,7 +48,7 @@
         <w:t>1</w:t>
       </w:r>
       <w:r>
-        <w:t>. Whether the *timing* of LTFU follows a consistent hazard shape is unknown. We fitted two-parameter Weibull cumulative-incidence models to four real, published time-to-event curves recovered by figure digitization: two TB treatment cohorts (Ethiopia</w:t>
+        <w:t>. Its determinants are known to be multilevel and context-dependent</w:t>
       </w:r>
       <w:r>
         <w:rPr>
@@ -57,7 +57,7 @@
         <w:t>2</w:t>
       </w:r>
       <w:r>
-        <w:t>, China</w:t>
+        <w:t>, and community/behavioural interventions to prevent it show inconsistent, setting-specific effectiveness</w:t>
       </w:r>
       <w:r>
         <w:rPr>
@@ -66,7 +66,7 @@
         <w:t>3</w:t>
       </w:r>
       <w:r>
-        <w:t>) and two non-TB comparators (HIV/ART retention</w:t>
+        <w:t>; why a single retention strategy does not travel well is unresolved. We give this qualitative problem a quantitative handle by asking whether the *timing* of LTFU (its hazard shape) is consistent across settings. We fitted two-parameter Weibull cumulative-incidence models to four real, published time-to-event curves recovered by figure digitization: two TB cohorts (Ethiopia</w:t>
       </w:r>
       <w:r>
         <w:rPr>
@@ -75,7 +75,7 @@
         <w:t>4</w:t>
       </w:r>
       <w:r>
-        <w:t>; antipsychotic time-to-discontinuation</w:t>
+        <w:t>, China</w:t>
       </w:r>
       <w:r>
         <w:rPr>
@@ -84,16 +84,34 @@
         <w:t>5</w:t>
       </w:r>
       <w:r>
-        <w:t xml:space="preserve">). The Weibull shape parameter k (k&gt;1 increasing-failure-rate [IFR]; k&lt;1 decreasing-failure-rate [DFR]) differed </w:t>
+        <w:t>) and two non-TB comparators (HIV/ART retention</w:t>
+      </w:r>
+      <w:r>
+        <w:rPr>
+          <w:vertAlign w:val="superscript"/>
+        </w:rPr>
+        <w:t>6</w:t>
+      </w:r>
+      <w:r>
+        <w:t>; antipsychotic time-to-discontinuation</w:t>
+      </w:r>
+      <w:r>
+        <w:rPr>
+          <w:vertAlign w:val="superscript"/>
+        </w:rPr>
+        <w:t>7</w:t>
+      </w:r>
+      <w:r>
+        <w:t xml:space="preserve">). The shape parameter k (k&gt;1 increasing-failure-rate [IFR]; k&lt;1 decreasing-failure-rate [DFR]) </w:t>
       </w:r>
       <w:r>
         <w:rPr>
           <w:b/>
         </w:rPr>
-        <w:t>qualitatively within TB</w:t>
+        <w:t>diverged within TB</w:t>
       </w:r>
       <w:r>
-        <w:t xml:space="preserve">: Ethiopia k=1.68 (95% CI 1.29–1.95) (IFR) versus China k=0.44 (95% CI 0.43–0.50) (DFR). Both comparators were DFR (HIV/ART k=0.63 (95% CI 0.54–0.73); antipsychotic k=0.49 (95% CI 0.42–0.57)). Thus, real TB LTFU is </w:t>
+        <w:t xml:space="preserve">: Ethiopia k=1.68 (95% CI 1.29–1.95) (IFR) versus China k=0.44 (95% CI 0.43–0.50) (DFR) — opposite sides of k=1 from only two cohorts, with non-identical outcome definitions. By contrast both comparators were DFR (HIV/ART k=0.63 (95% CI 0.54–0.73); antipsychotic k=0.49 (95% CI 0.42–0.57)), i.e. mutually consistent. TB LTFU is therefore </w:t>
       </w:r>
       <w:r>
         <w:rPr>
@@ -102,7 +120,7 @@
         <w:t>not</w:t>
       </w:r>
       <w:r>
-        <w:t xml:space="preserve"> uniformly increasing-hazard; it is heterogeneous, and the mechanism is unclear. Larger, individual-level datasets are needed to test whether this heterogeneity is real and what drives it. All results regenerate from code and the digitized source figures.</w:t>
+        <w:t xml:space="preserve"> uniformly increasing-hazard: its hazard shape is heterogeneous across countries (plausibly because the country-specific mechanisms that generate LTFU differ), which mathematically illustrates why pooled TB evidence and a one-size retention intervention are hard to build, whereas the comparator interventions may pool more readily. The cause of the shape divergence is unknown. All results regenerate from code and the digitized source figures.</w:t>
       </w:r>
     </w:p>
     <w:p>
@@ -128,7 +146,25 @@
         <w:t>1</w:t>
       </w:r>
       <w:r>
-        <w:t>. Programmatic reports usually give only a single cumulative LTFU proportion, obscuring *when* during treatment patients disengage. The hazard shape has practical meaning: an increasing hazard (k&gt;1) would argue for intensified support late in treatment, whereas a decreasing hazard (k&lt;1) would prioritize the earliest weeks. We asked a deliberately narrow, hypothesis-generating question: across the few TB cohorts that publish a time-resolved LTFU curve, is the Weibull shape consistent, and how does it compare with dropout in unrelated chronic treatments?</w:t>
+        <w:t>. Two things are already established. First, the determinants of treatment interruption are multilevel and strongly context-dependent, differing by health system, case mix and social setting</w:t>
+      </w:r>
+      <w:r>
+        <w:rPr>
+          <w:vertAlign w:val="superscript"/>
+        </w:rPr>
+        <w:t>2</w:t>
+      </w:r>
+      <w:r>
+        <w:t>. Second, interventions intended to keep patients in care—community-based, behavioural and digital approaches—show inconsistent, setting-specific effectiveness, so no single strategy has proved universally transferable</w:t>
+      </w:r>
+      <w:r>
+        <w:rPr>
+          <w:vertAlign w:val="superscript"/>
+        </w:rPr>
+        <w:t>3</w:t>
+      </w:r>
+      <w:r>
+        <w:t>. What has been missing is a *quantitative* description of the phenomenon that plausibly underlies this: whether patients across settings even disengage on the same time-course. Programmatic reports usually give a single cumulative LTFU proportion, hiding *when* during treatment patients leave. The hazard shape carries direct operational meaning: an increasing hazard (k&gt;1) argues for intensified support late in treatment, a decreasing hazard (k&lt;1) for front-loading it in the earliest weeks. We therefore asked a narrow question: across TB cohorts that publish a time-resolved LTFU curve, is the Weibull hazard shape consistent, and how does it compare with dropout in unrelated chronic treatments? A divergence within TB but consistency among comparators would give a concrete, reproducible measure of why TB retention resists a unified approach.</w:t>
       </w:r>
     </w:p>
     <w:p>
@@ -151,7 +187,7 @@
         <w:rPr>
           <w:vertAlign w:val="superscript"/>
         </w:rPr>
-        <w:t>2</w:t>
+        <w:t>4</w:t>
       </w:r>
       <w:r>
         <w:t>, and the all-patient time-to-LTFU Kaplan–Meier curve from a 5-year Chinese cohort</w:t>
@@ -160,7 +196,7 @@
         <w:rPr>
           <w:vertAlign w:val="superscript"/>
         </w:rPr>
-        <w:t>3</w:t>
+        <w:t>5</w:t>
       </w:r>
       <w:r>
         <w:t>. Comparators were an HIV/ART retention curve</w:t>
@@ -169,7 +205,7 @@
         <w:rPr>
           <w:vertAlign w:val="superscript"/>
         </w:rPr>
-        <w:t>4</w:t>
+        <w:t>6</w:t>
       </w:r>
       <w:r>
         <w:t xml:space="preserve"> and an antipsychotic time-to-discontinuation curve</w:t>
@@ -178,7 +214,7 @@
         <w:rPr>
           <w:vertAlign w:val="superscript"/>
         </w:rPr>
-        <w:t>5</w:t>
+        <w:t>7</w:t>
       </w:r>
       <w:r>
         <w:t>. Curves were digitized from the published figures by an in-house pixel extractor with axis calibration read from figure tick marks (values taken from curve pixels, not entered by hand). For each dataset we fitted the Weibull cumulative-incidence model F(t)=1−exp(−(t/λ)^k) by nonlinear least squares, obtained a bootstrap 95% CI for k, and compared fit with exponential (k=1) and log-normal models by AIC. The shape parameter k is unit-free, so mixed follow-up units (months, days) do not affect the cross-study comparison. Data, code and a one-command build are in the public repository (Data and code availability).</w:t>
@@ -568,7 +604,7 @@
         <w:t>Figure 1.</w:t>
       </w:r>
       <w:r>
-        <w:t xml:space="preserve"> Weibull cumulative-incidence fits (red) to digitized dropout curves (points) for two TB cohorts and two comparators. TB is split between IFR (Ethiopia) and DFR (China); comparators are DFR.</w:t>
+        <w:t xml:space="preserve"> Weibull cumulative-incidence fits (red) to digitized dropout curves (points) for two TB cohorts and two comparators. TB is split between IFR (Ethiopia) and DFR (China), spanning the whole range; comparators are consistently DFR.</w:t>
       </w:r>
     </w:p>
     <w:p>
@@ -585,16 +621,42 @@
         <w:spacing w:before="120"/>
       </w:pPr>
       <w:r>
-        <w:t xml:space="preserve">The headline observation is negative and, we think, honest: </w:t>
+        <w:t>The result puts a number on an accepted but qualitative problem. It is already known that TB LTFU determinants are context-dependent</w:t>
+      </w:r>
+      <w:r>
+        <w:rPr>
+          <w:vertAlign w:val="superscript"/>
+        </w:rPr>
+        <w:t>2</w:t>
+      </w:r>
+      <w:r>
+        <w:t xml:space="preserve"> and that retention interventions do not transfer cleanly between settings</w:t>
+      </w:r>
+      <w:r>
+        <w:rPr>
+          <w:vertAlign w:val="superscript"/>
+        </w:rPr>
+        <w:t>3</w:t>
+      </w:r>
+      <w:r>
+        <w:t xml:space="preserve">; our contribution is to show that this heterogeneity is visible in the </w:t>
       </w:r>
       <w:r>
         <w:rPr>
           <w:b/>
         </w:rPr>
-        <w:t>real TB treatment LTFU does not follow a single hazard shape.</w:t>
+        <w:t>hazard shape itself</w:t>
       </w:r>
       <w:r>
-        <w:t xml:space="preserve"> One TB cohort accelerated (late-concentrated LTFU) while another was front-loaded, spanning the whole IFR–DFR range that the two unrelated comparators occupied only on the DFR side. We cannot explain the TB heterogeneity from these data. Plausible contributors include different outcome definitions (competing-risk CIF vs all-patient KM), different case mix and programme context, the 6- vs 12-month observation windows, and digitization of aggregate rather than individual-level curves. The point of this short report is precisely that the heterogeneity is visible yet unexplained: with more TB cohorts—ideally individual patient data with consistent LTFU definitions—one could test whether the shape varies with regimen phase, health-system factors or case mix, and whether any subgroup reliably shows late-rising hazard that would justify late-treatment retention support.</w:t>
+        <w:t>. Two TB cohorts fell on opposite sides of k=1 — one late-accelerating (IFR), one strongly front-loaded (DFR) — spanning the entire range that the two unrelated comparators occupied only on the DFR side. In other words, the comparator interventions were mutually consistent (both DFR) and would plausibly support a common time-course model, whereas the two TB settings did not share even the *direction* of their hazard. This is a compact, reproducible illustration of why pooled TB evidence and a single unified retention intervention are hard to construct: if countries differ in *when* patients disengage, an intervention timed for one will be mistimed for another.</w:t>
+      </w:r>
+    </w:p>
+    <w:p>
+      <w:pPr>
+        <w:spacing w:before="120"/>
+      </w:pPr>
+      <w:r>
+        <w:t>We cannot explain the divergence, and we do not claim to. It is confounded with different outcome definitions (competing-risk CIF vs all-patient KM), case mix, programme context and the 6- vs 12-month observation windows, and it rests on digitized aggregate curves rather than individual patient data. That the mechanism is unknown is precisely the open question worth stating: the country-specific processes that generate LTFU appear to differ enough to change the hazard shape, and identifying what drives this — regimen phase, health-system factors, or case mix — would require more TB cohorts with individual-level data and harmonized LTFU definitions. Until then, the honest reading is that TB retention is a heterogeneous target, not a single one.</w:t>
       </w:r>
     </w:p>
     <w:p>
@@ -645,7 +707,7 @@
         <w:spacing w:before="60"/>
       </w:pPr>
       <w:r>
-        <w:t>1. World Health Organization. Global Tuberculosis Report 2023. Geneva: WHO; 2023.</w:t>
+        <w:t>1. World Health Organization. Global Tuberculosis Report 2024. Geneva: WHO; 2024.</w:t>
       </w:r>
     </w:p>
     <w:p>
@@ -653,7 +715,7 @@
         <w:spacing w:before="60"/>
       </w:pPr>
       <w:r>
-        <w:t>2. Fufa DB, Diriba TA, Dame KT, Debusho LK. Competing risk models to evaluate the factors for time to loss to follow-up among tuberculosis patients at Ambo General Hospital. Arch Public Health. 2023;81:113. doi:10.1186/s13690-023-01130-2.</w:t>
+        <w:t>2. Tsibiyane M, Faye LM, Ndayi K, Sineke N, Tyeshani L, Faleni M, et al. Multilevel determinants of tuberculosis treatment interruption in rural South Africa: insights from primary healthcare nurses. Int J Environ Res Public Health. 2026;23(5):598. doi:10.3390/ijerph23050598.</w:t>
       </w:r>
     </w:p>
     <w:p>
@@ -661,7 +723,7 @@
         <w:spacing w:before="60"/>
       </w:pPr>
       <w:r>
-        <w:t>3. Jiang Y, Chen J, Ying M, Liu L, Li M, Lu S, et al. Factors associated with loss to follow-up before and after treatment initiation among patients with tuberculosis: a 5-year observation in China. Front Med. 2023;10:1136094. doi:10.3389/fmed.2023.1136094.</w:t>
+        <w:t>3. Kedthongma W, Usaprom S, Phakdeekul W. Community-based interventions to improve tuberculosis treatment outcomes: a meta-analysis. MethodsX. 2026;16:103893. doi:10.1016/j.mex.2026.103893.</w:t>
       </w:r>
     </w:p>
     <w:p>
@@ -669,7 +731,7 @@
         <w:spacing w:before="60"/>
       </w:pPr>
       <w:r>
-        <w:t>4. Daba O, Tsegaye D, Reshad M. Incidence and predictors of loss to follow-up among ART patients on follow-up at public health facilities in Southwest Ethiopia: a time-to-event analysis. J Int Assoc Provid AIDS Care. 2026;25:23259582261426232. doi:10.1177/23259582261426232.</w:t>
+        <w:t>4. Fufa DB, Diriba TA, Dame KT, Debusho LK. Competing risk models to evaluate the factors for time to loss to follow-up among tuberculosis patients at Ambo General Hospital. Arch Public Health. 2023;81:113. doi:10.1186/s13690-023-01130-2.</w:t>
       </w:r>
     </w:p>
     <w:p>
@@ -677,7 +739,23 @@
         <w:spacing w:before="60"/>
       </w:pPr>
       <w:r>
-        <w:t>5. Salas Aranda P, Garcia Cerdan C, Martin Gomez C, Lorenzo Romo C, Turrion Gomez M, Isidoro Garcia M, et al. Time to discontinuation in routine clinical practice of the initially prescribed antipsychotic treatment in patients with first-episode psychosis. Eur Psychiatry. 2025;68(Suppl):PMC12437960.</w:t>
+        <w:t>5. Jiang Y, Chen J, Ying M, Liu L, Li M, Lu S, et al. Factors associated with loss to follow-up before and after treatment initiation among patients with tuberculosis: a 5-year observation in China. Front Med. 2023;10:1136094. doi:10.3389/fmed.2023.1136094.</w:t>
+      </w:r>
+    </w:p>
+    <w:p>
+      <w:pPr>
+        <w:spacing w:before="60"/>
+      </w:pPr>
+      <w:r>
+        <w:t>6. Daba O, Tsegaye D, Reshad M. Incidence and predictors of loss to follow-up among ART patients on follow-up at public health facilities in Southwest Ethiopia: a time-to-event analysis. J Int Assoc Provid AIDS Care. 2026;25:23259582261426232. doi:10.1177/23259582261426232.</w:t>
+      </w:r>
+    </w:p>
+    <w:p>
+      <w:pPr>
+        <w:spacing w:before="60"/>
+      </w:pPr>
+      <w:r>
+        <w:t>7. Salas Aranda P, Garcia Cerdan C, Martin Gomez C, Lorenzo Romo C, Turrion Gomez M, Isidoro Garcia M, et al. Time to discontinuation in routine clinical practice of the initially prescribed antipsychotic treatment in patients with first-episode psychosis. Eur Psychiatry. 2025;68(Suppl):PMC12437960.</w:t>
       </w:r>
     </w:p>
     <w:sectPr>

</xml_diff>

<commit_message>
weibull: remove reader-external context from manuscript body (no prior-version/reviewer references)
Co-Authored-By: Tatsuki Onishi <bougtoir@gmail.com>
</commit_message>
<xml_diff>
--- a/weibull-clinical-dropout/reanalysis_real/manuscript/tb_dropout_heterogeneity_short_communication.docx
+++ b/weibull-clinical-dropout/reanalysis_real/manuscript/tb_dropout_heterogeneity_short_communication.docx
@@ -11,7 +11,7 @@
           <w:b/>
           <w:sz w:val="30"/>
         </w:rPr>
-        <w:t>Divergent hazard shapes of tuberculosis treatment loss to follow-up: a reproducible re-analysis quantifying the heterogeneity that hinders a unified retention intervention</w:t>
+        <w:t>Divergent hazard shapes of tuberculosis treatment loss to follow-up: a reproducible analysis of published curves quantifying the heterogeneity that hinders a unified retention intervention</w:t>
       </w:r>
     </w:p>
     <w:p>
@@ -673,7 +673,7 @@
         <w:spacing w:before="120"/>
       </w:pPr>
       <w:r>
-        <w:t>Only two TB and two comparator curves met the bar of a genuinely time-resolved, openly available dropout curve; earlier five-country claims could not be reproduced from primary sources and are not made here. Estimates come from digitized aggregate curves, not individual patient data; the Ethiopian estimate is a competing-risk *subdistribution*-hazard shape; the antipsychotic cohort is small (n≈42) and illustrative; KM plateaus reflect administrative censoring. These results are hypothesis-generating, not confirmatory.</w:t>
+        <w:t>Only two TB and two comparator curves met the bar of a genuinely time-resolved, openly available dropout curve, so the analysis is small and hypothesis-generating. Estimates come from digitized aggregate curves, not individual patient data; the Ethiopian estimate is a competing-risk *subdistribution*-hazard shape; the antipsychotic cohort is small (n≈42) and illustrative; KM plateaus reflect administrative censoring. The findings are hypothesis-generating, not confirmatory.</w:t>
       </w:r>
     </w:p>
     <w:p>

</xml_diff>

<commit_message>
weibull: reformat short communication to IDoP/BMC structure (structured abstract, Background/Conclusions, Declarations, keywords)
Co-Authored-By: Tatsuki Onishi <bougtoir@gmail.com>
</commit_message>
<xml_diff>
--- a/weibull-clinical-dropout/reanalysis_real/manuscript/tb_dropout_heterogeneity_short_communication.docx
+++ b/weibull-clinical-dropout/reanalysis_real/manuscript/tb_dropout_heterogeneity_short_communication.docx
@@ -39,7 +39,13 @@
         <w:spacing w:before="120"/>
       </w:pPr>
       <w:r>
-        <w:t>Loss to follow-up (LTFU) during tuberculosis (TB) treatment is a major barrier to cure and transmission control</w:t>
+        <w:rPr>
+          <w:b/>
+        </w:rPr>
+        <w:t>Background</w:t>
+      </w:r>
+      <w:r>
+        <w:t xml:space="preserve"> Loss to follow-up (LTFU) during tuberculosis (TB) treatment is a major barrier to cure and transmission control</w:t>
       </w:r>
       <w:r>
         <w:rPr>
@@ -48,7 +54,7 @@
         <w:t>1</w:t>
       </w:r>
       <w:r>
-        <w:t>. Its determinants are known to be multilevel and context-dependent</w:t>
+        <w:t>. Its determinants are multilevel and context-dependent</w:t>
       </w:r>
       <w:r>
         <w:rPr>
@@ -57,7 +63,7 @@
         <w:t>2</w:t>
       </w:r>
       <w:r>
-        <w:t>, and community/behavioural interventions to prevent it show inconsistent, setting-specific effectiveness</w:t>
+        <w:t xml:space="preserve"> and interventions to prevent it show inconsistent, setting-specific effectiveness</w:t>
       </w:r>
       <w:r>
         <w:rPr>
@@ -66,7 +72,21 @@
         <w:t>3</w:t>
       </w:r>
       <w:r>
-        <w:t>; why a single retention strategy does not travel well is unresolved. We give this qualitative problem a quantitative handle by asking whether the *timing* of LTFU (its hazard shape) is consistent across settings. We fitted two-parameter Weibull cumulative-incidence models to four real, published time-to-event curves recovered by figure digitization: two TB cohorts (Ethiopia</w:t>
+        <w:t>, but whether the *timing* of LTFU follows a consistent hazard shape across settings has not been quantified.</w:t>
+      </w:r>
+    </w:p>
+    <w:p>
+      <w:pPr>
+        <w:spacing w:before="80"/>
+      </w:pPr>
+      <w:r>
+        <w:rPr>
+          <w:b/>
+        </w:rPr>
+        <w:t>Methods</w:t>
+      </w:r>
+      <w:r>
+        <w:t xml:space="preserve"> We fitted two-parameter Weibull cumulative-incidence models F(t)=1−exp(−(t/λ)^k) to four real, published time-to-event curves recovered by figure digitization: two TB treatment cohorts (Ethiopia</w:t>
       </w:r>
       <w:r>
         <w:rPr>
@@ -102,25 +122,49 @@
         <w:t>7</w:t>
       </w:r>
       <w:r>
-        <w:t xml:space="preserve">). The shape parameter k (k&gt;1 increasing-failure-rate [IFR]; k&lt;1 decreasing-failure-rate [DFR]) </w:t>
+        <w:t>). The shape parameter k (k&gt;1 increasing-failure-rate [IFR]; k&lt;1 decreasing-failure-rate [DFR]) was estimated with a bootstrap 95% confidence interval (CI) and compared with exponential and log-normal fits by the Akaike information criterion (AIC).</w:t>
       </w:r>
+    </w:p>
+    <w:p>
+      <w:pPr>
+        <w:spacing w:before="80"/>
+      </w:pPr>
       <w:r>
         <w:rPr>
           <w:b/>
         </w:rPr>
-        <w:t>diverged within TB</w:t>
+        <w:t>Results</w:t>
       </w:r>
       <w:r>
-        <w:t xml:space="preserve">: Ethiopia k=1.68 (95% CI 1.29–1.95) (IFR) versus China k=0.44 (95% CI 0.43–0.50) (DFR) — opposite sides of k=1 from only two cohorts, with non-identical outcome definitions. By contrast both comparators were DFR (HIV/ART k=0.63 (95% CI 0.54–0.73); antipsychotic k=0.49 (95% CI 0.42–0.57)), i.e. mutually consistent. TB LTFU is therefore </w:t>
+        <w:t xml:space="preserve"> The shape parameter diverged within TB: Ethiopia k=1.68 (95% CI 1.29–1.95) (IFR) versus China k=0.44 (95% CI 0.43–0.50) (DFR) — opposite sides of k=1 from only two cohorts, with non-identical outcome definitions. Both comparators were DFR (HIV/ART k=0.63 (95% CI 0.54–0.73); antipsychotic k=0.49 (95% CI 0.42–0.57)), i.e. mutually consistent.</w:t>
       </w:r>
+    </w:p>
+    <w:p>
+      <w:pPr>
+        <w:spacing w:before="80"/>
+      </w:pPr>
       <w:r>
         <w:rPr>
           <w:b/>
         </w:rPr>
-        <w:t>not</w:t>
+        <w:t>Conclusions</w:t>
       </w:r>
       <w:r>
-        <w:t xml:space="preserve"> uniformly increasing-hazard: its hazard shape is heterogeneous across countries (plausibly because the country-specific mechanisms that generate LTFU differ), which mathematically illustrates why pooled TB evidence and a one-size retention intervention are hard to build, whereas the comparator interventions may pool more readily. The cause of the shape divergence is unknown. All results regenerate from code and the digitized source figures.</w:t>
+        <w:t xml:space="preserve"> TB LTFU is not uniformly increasing-hazard: its hazard shape is heterogeneous across countries, plausibly because the country-specific mechanisms that generate LTFU differ. This gives a compact, reproducible quantification of why pooled TB evidence and a one-size retention intervention are hard to build, whereas the comparator interventions may pool more readily. The cause of the divergence is unknown and warrants individual-level study.</w:t>
+      </w:r>
+    </w:p>
+    <w:p>
+      <w:pPr>
+        <w:spacing w:before="80"/>
+      </w:pPr>
+      <w:r>
+        <w:rPr>
+          <w:b/>
+        </w:rPr>
+        <w:t>Keywords</w:t>
+      </w:r>
+      <w:r>
+        <w:t xml:space="preserve"> Tuberculosis; Loss to follow-up; Treatment adherence; Weibull; Hazard function; Survival analysis; Health systems</w:t>
       </w:r>
     </w:p>
     <w:p>
@@ -129,7 +173,7 @@
           <w:b/>
           <w:sz w:val="26"/>
         </w:rPr>
-        <w:t>1. Introduction</w:t>
+        <w:t>Background</w:t>
       </w:r>
     </w:p>
     <w:p>
@@ -173,7 +217,7 @@
           <w:b/>
           <w:sz w:val="26"/>
         </w:rPr>
-        <w:t>2. Methods</w:t>
+        <w:t>Methods</w:t>
       </w:r>
     </w:p>
     <w:p>
@@ -226,7 +270,7 @@
           <w:b/>
           <w:sz w:val="26"/>
         </w:rPr>
-        <w:t>3. Results</w:t>
+        <w:t>Results</w:t>
       </w:r>
     </w:p>
     <w:p>
@@ -613,7 +657,7 @@
           <w:b/>
           <w:sz w:val="26"/>
         </w:rPr>
-        <w:t>4. Discussion</w:t>
+        <w:t>Discussion</w:t>
       </w:r>
     </w:p>
     <w:p>
@@ -665,7 +709,7 @@
           <w:b/>
           <w:sz w:val="26"/>
         </w:rPr>
-        <w:t>5. Limitations</w:t>
+        <w:t>Limitations</w:t>
       </w:r>
     </w:p>
     <w:p>
@@ -682,7 +726,7 @@
           <w:b/>
           <w:sz w:val="26"/>
         </w:rPr>
-        <w:t>6. Data and code availability</w:t>
+        <w:t>Conclusions</w:t>
       </w:r>
     </w:p>
     <w:p>
@@ -690,7 +734,114 @@
         <w:spacing w:before="120"/>
       </w:pPr>
       <w:r>
-        <w:t>All source figures, digitized CSVs, analysis code and a one-command build (`make`) that regenerates every number, the table and Figure 1 are in the public repository under weibull-clinical-dropout/reanalysis_real/. No result is hard-coded.</w:t>
+        <w:t>Across the few TB cohorts that publish a time-resolved LTFU curve, the Weibull hazard shape is not consistent: two national settings fell on opposite sides of k=1, whereas two unrelated chronic-treatment comparators were mutually consistent (both DFR). The heterogeneity of TB LTFU is therefore visible in the hazard shape itself and offers a compact, reproducible explanation for why pooled TB evidence and a single unified retention strategy are difficult to construct. Individual-level data with harmonized LTFU definitions are needed to identify what drives the divergence.</w:t>
+      </w:r>
+    </w:p>
+    <w:p>
+      <w:r>
+        <w:rPr>
+          <w:b/>
+          <w:sz w:val="26"/>
+        </w:rPr>
+        <w:t>Declarations</w:t>
+      </w:r>
+    </w:p>
+    <w:p>
+      <w:pPr>
+        <w:spacing w:before="120"/>
+      </w:pPr>
+      <w:r>
+        <w:rPr>
+          <w:b/>
+        </w:rPr>
+        <w:t>Ethics approval and consent to participate</w:t>
+      </w:r>
+      <w:r>
+        <w:t xml:space="preserve"> Not applicable. This study is a secondary analysis of aggregate, already-published, de-identified survival curves and involved no new human participants or individual-level data.</w:t>
+      </w:r>
+    </w:p>
+    <w:p>
+      <w:pPr>
+        <w:spacing w:before="80"/>
+      </w:pPr>
+      <w:r>
+        <w:rPr>
+          <w:b/>
+        </w:rPr>
+        <w:t>Consent for publication</w:t>
+      </w:r>
+      <w:r>
+        <w:t xml:space="preserve"> Not applicable.</w:t>
+      </w:r>
+    </w:p>
+    <w:p>
+      <w:pPr>
+        <w:spacing w:before="80"/>
+      </w:pPr>
+      <w:r>
+        <w:rPr>
+          <w:b/>
+        </w:rPr>
+        <w:t>Availability of data and materials</w:t>
+      </w:r>
+      <w:r>
+        <w:t xml:space="preserve"> All source figures, digitized CSV datasets, analysis code and a one-command build that regenerates every reported number, Table 1 and Figure 1 are openly available in the project repository. No result is hard-coded; every value is reproduced from the source data by the released code.</w:t>
+      </w:r>
+    </w:p>
+    <w:p>
+      <w:pPr>
+        <w:spacing w:before="80"/>
+      </w:pPr>
+      <w:r>
+        <w:rPr>
+          <w:b/>
+        </w:rPr>
+        <w:t>Competing interests</w:t>
+      </w:r>
+      <w:r>
+        <w:t xml:space="preserve"> The authors declare that they have no competing interests.</w:t>
+      </w:r>
+    </w:p>
+    <w:p>
+      <w:pPr>
+        <w:spacing w:before="80"/>
+      </w:pPr>
+      <w:r>
+        <w:rPr>
+          <w:b/>
+        </w:rPr>
+        <w:t>Funding</w:t>
+      </w:r>
+      <w:r>
+        <w:t xml:space="preserve"> This study received no specific funding.</w:t>
+      </w:r>
+    </w:p>
+    <w:p>
+      <w:pPr>
+        <w:spacing w:before="80"/>
+      </w:pPr>
+      <w:r>
+        <w:rPr>
+          <w:b/>
+        </w:rPr>
+        <w:t>Authors' contributions</w:t>
+      </w:r>
+      <w:r>
+        <w:t xml:space="preserve"> The author(s) conceived the study, digitized the source curves, implemented the analysis and wrote the manuscript. All authors read and approved the final manuscript.</w:t>
+      </w:r>
+    </w:p>
+    <w:p>
+      <w:pPr>
+        <w:spacing w:before="80"/>
+      </w:pPr>
+      <w:r>
+        <w:rPr>
+          <w:b/>
+        </w:rPr>
+        <w:t>Acknowledgements</w:t>
+      </w:r>
+      <w:r>
+        <w:t xml:space="preserve"> Not applicable.</w:t>
       </w:r>
     </w:p>
     <w:p>

</xml_diff>

<commit_message>
weibull: add health-systems/policy paragraph; add IDoP submission package (title page, cover letter)
Co-Authored-By: Tatsuki Onishi <bougtoir@gmail.com>
</commit_message>
<xml_diff>
--- a/weibull-clinical-dropout/reanalysis_real/manuscript/tb_dropout_heterogeneity_short_communication.docx
+++ b/weibull-clinical-dropout/reanalysis_real/manuscript/tb_dropout_heterogeneity_short_communication.docx
@@ -704,6 +704,23 @@
       </w:r>
     </w:p>
     <w:p>
+      <w:pPr>
+        <w:spacing w:before="120"/>
+      </w:pPr>
+      <w:r>
+        <w:t>The observation has practical implications for TB programmes, particularly in resource-limited, high-burden settings where retention resources are scarce and must be targeted. Because the hazard shape encodes *when* patients disengage, it maps directly onto the timing of adherence support: a front-loaded (DFR) setting argues for concentrating counselling, financial or social support in the intensive phase, whereas a late-accelerating (IFR) setting argues for sustained or intensified support in the continuation phase. A retention package optimized for one hazard shape will be mistimed in the other, which offers a concrete, quantitative reason why globally standardized adherence interventions have shown inconsistent effects across programmes</w:t>
+      </w:r>
+      <w:r>
+        <w:rPr>
+          <w:vertAlign w:val="superscript"/>
+        </w:rPr>
+        <w:t>3</w:t>
+      </w:r>
+      <w:r>
+        <w:t>. Routinely reporting the time-to-LTFU curve — not only the final cumulative proportion — would let national programmes locate their own hazard shape and time support accordingly, and would make cross-country evidence poolable in a way that a single summary statistic cannot.</w:t>
+      </w:r>
+    </w:p>
+    <w:p>
       <w:r>
         <w:rPr>
           <w:b/>

</xml_diff>

<commit_message>
weibull: add age-at-onset hypothesis paragraph (China aging vs SSA young-adult TB), ref 8; keywords updated
Co-Authored-By: Tatsuki Onishi <bougtoir@gmail.com>
</commit_message>
<xml_diff>
--- a/weibull-clinical-dropout/reanalysis_real/manuscript/tb_dropout_heterogeneity_short_communication.docx
+++ b/weibull-clinical-dropout/reanalysis_real/manuscript/tb_dropout_heterogeneity_short_communication.docx
@@ -164,7 +164,7 @@
         <w:t>Keywords</w:t>
       </w:r>
       <w:r>
-        <w:t xml:space="preserve"> Tuberculosis; Loss to follow-up; Treatment adherence; Weibull; Hazard function; Survival analysis; Health systems</w:t>
+        <w:t xml:space="preserve"> Tuberculosis; Loss to follow-up; Treatment adherence; Weibull; Hazard function; Survival analysis; Age at onset; Health systems</w:t>
       </w:r>
     </w:p>
     <w:p>
@@ -708,6 +708,32 @@
         <w:spacing w:before="120"/>
       </w:pPr>
       <w:r>
+        <w:t>One candidate deserves explicit mention because it could unify the two observations — that the unrelated comparators behaved alike while the two TB settings did not — namely the age structure of disease onset. The two TB cohorts arise from demographically divergent epidemics: TB in China is increasingly concentrated in the elderly</w:t>
+      </w:r>
+      <w:r>
+        <w:rPr>
+          <w:vertAlign w:val="superscript"/>
+        </w:rPr>
+        <w:t>8</w:t>
+      </w:r>
+      <w:r>
+        <w:t>, whereas high-burden sub-Saharan settings such as Ethiopia are dominated by young adults, and age was itself a significant risk factor for LTFU in the Ethiopian cohort</w:t>
+      </w:r>
+      <w:r>
+        <w:rPr>
+          <w:vertAlign w:val="superscript"/>
+        </w:rPr>
+        <w:t>4</w:t>
+      </w:r>
+      <w:r>
+        <w:t>. If the age-at-onset distribution governs competing mortality, comorbidity and the reasons patients disengage, it could plausibly determine whether the LTFU hazard rises or falls over the course of treatment — in effect a time-to-onset (age) distribution modulating the time-to-LTFU hazard. We stress that this is a hypothesis, not a result: our curves are aggregate and not age-stratified, so neither an age-at-onset distribution nor an age-by-LTFU-timing interaction can be fitted here without inventing data. Testing it would require age-stratified time-to-LTFU curves or individual patient data.</w:t>
+      </w:r>
+    </w:p>
+    <w:p>
+      <w:pPr>
+        <w:spacing w:before="120"/>
+      </w:pPr>
+      <w:r>
         <w:t>The observation has practical implications for TB programmes, particularly in resource-limited, high-burden settings where retention resources are scarce and must be targeted. Because the hazard shape encodes *when* patients disengage, it maps directly onto the timing of adherence support: a front-loaded (DFR) setting argues for concentrating counselling, financial or social support in the intensive phase, whereas a late-accelerating (IFR) setting argues for sustained or intensified support in the continuation phase. A retention package optimized for one hazard shape will be mistimed in the other, which offers a concrete, quantitative reason why globally standardized adherence interventions have shown inconsistent effects across programmes</w:t>
       </w:r>
       <w:r>
@@ -924,6 +950,14 @@
       </w:pPr>
       <w:r>
         <w:t>7. Salas Aranda P, Garcia Cerdan C, Martin Gomez C, Lorenzo Romo C, Turrion Gomez M, Isidoro Garcia M, et al. Time to discontinuation in routine clinical practice of the initially prescribed antipsychotic treatment in patients with first-episode psychosis. Eur Psychiatry. 2025;68(Suppl):PMC12437960.</w:t>
+      </w:r>
+    </w:p>
+    <w:p>
+      <w:pPr>
+        <w:spacing w:before="60"/>
+      </w:pPr>
+      <w:r>
+        <w:t>8. Yu Y, Xian S, Yang D, Mu L, Han Y, Luo W, et al. Temporal trends in tuberculosis incidence among the aging population in Southwest China: a retrospective study. BMC Geriatr. 2026;26:373. doi:10.1186/s12877-026-07373-2.</w:t>
       </w:r>
     </w:p>
     <w:sectPr>

</xml_diff>

<commit_message>
weibull: add 'Clinical trial number: not applicable' to Declarations (IDoP technical check)
Co-Authored-By: Tatsuki Onishi <bougtoir@gmail.com>
</commit_message>
<xml_diff>
--- a/weibull-clinical-dropout/reanalysis_real/manuscript/tb_dropout_heterogeneity_short_communication.docx
+++ b/weibull-clinical-dropout/reanalysis_real/manuscript/tb_dropout_heterogeneity_short_communication.docx
@@ -825,6 +825,20 @@
         <w:rPr>
           <w:b/>
         </w:rPr>
+        <w:t>Clinical trial number</w:t>
+      </w:r>
+      <w:r>
+        <w:t xml:space="preserve"> Not applicable.</w:t>
+      </w:r>
+    </w:p>
+    <w:p>
+      <w:pPr>
+        <w:spacing w:before="80"/>
+      </w:pPr>
+      <w:r>
+        <w:rPr>
+          <w:b/>
+        </w:rPr>
         <w:t>Availability of data and materials</w:t>
       </w:r>
       <w:r>

</xml_diff>

<commit_message>
Reframe as Original Research Article; trim abstract to TMIH 250-word limit
Co-Authored-By: Tatsuki Onishi <bougtoir@gmail.com>
</commit_message>
<xml_diff>
--- a/weibull-clinical-dropout/reanalysis_real/manuscript/tb_dropout_heterogeneity_short_communication.docx
+++ b/weibull-clinical-dropout/reanalysis_real/manuscript/tb_dropout_heterogeneity_short_communication.docx
@@ -22,7 +22,7 @@
         <w:rPr>
           <w:i/>
         </w:rPr>
-        <w:t>Short Communication (scoping study)</w:t>
+        <w:t>Original Research Article</w:t>
       </w:r>
     </w:p>
     <w:p>
@@ -54,7 +54,7 @@
         <w:t>1</w:t>
       </w:r>
       <w:r>
-        <w:t>. Its determinants are multilevel and context-dependent</w:t>
+        <w:t>; its determinants are context-dependent</w:t>
       </w:r>
       <w:r>
         <w:rPr>
@@ -63,7 +63,7 @@
         <w:t>2</w:t>
       </w:r>
       <w:r>
-        <w:t xml:space="preserve"> and retention interventions show inconsistent, setting-specific effectiveness</w:t>
+        <w:t xml:space="preserve"> and retention interventions inconsistent</w:t>
       </w:r>
       <w:r>
         <w:rPr>
@@ -72,7 +72,7 @@
         <w:t>3</w:t>
       </w:r>
       <w:r>
-        <w:t>, yet adherence support is often chosen by clinical intuition rather than targeted to *when* patients actually disengage. Deciding when to intensify support, and later verifying that it worked, requires the *timing* of dropout — the hazard shape — to be visible in the published evidence. We asked how often that timing is actually reported in a reproducibly usable form, and whether, where it is, the hazard shape is consistent within and across diseases.</w:t>
+        <w:t>, yet support is rarely targeted to *when* patients disengage. We asked how often dropout timing (the hazard shape) is reported reproducibly and whether it is consistent within and across diseases.</w:t>
       </w:r>
     </w:p>
     <w:p>
@@ -86,7 +86,7 @@
         <w:t>Methods</w:t>
       </w:r>
       <w:r>
-        <w:t xml:space="preserve"> We ran a reproducible Europe PMC search (open-access TB/HIV LTFU or retention reports mentioning a time-to-event curve; 7594 records, 2026-07-17). Our eligibility criterion was pragmatic and unusual: a figure had to make dropout *visible over time* as a single, cleanly separable, digitizable curve (Kaplan–Meier survivor or competing-risk cumulative incidence), not merely a final cumulative LTFU proportion. Eligible curves were digitized from figure pixels and fitted with a two-parameter Weibull cumulative-incidence model F(t)=1−exp(−(t/λ)^k); the shape parameter k (k&gt;1 increasing-failure-rate [IFR], support best sustained late; k&lt;1 decreasing-failure-rate [DFR], support best front-loaded) was estimated with a bootstrap 95% confidence interval (CI) and compared with exponential and log-normal fits by the Akaike information criterion (AIC).</w:t>
+        <w:t xml:space="preserve"> A reproducible Europe PMC search (open-access TB/HIV reports mentioning a time-to-event curve; 7594 records, 2026-07-17) required a single, digitizable dropout curve (Kaplan–Meier or competing-risk cumulative incidence), not a final proportion. Eligible curves were digitized and fitted with a Weibull model F(t)=1−exp(−(t/λ)^k); the shape k (k&gt;1 increasing-failure-rate [IFR]; k&lt;1 decreasing-failure-rate [DFR]) was bootstrapped (95% confidence interval [CI]) and compared with exponential and log-normal fits by the Akaike information criterion (AIC).</w:t>
       </w:r>
     </w:p>
     <w:p>
@@ -100,7 +100,7 @@
         <w:t>Results</w:t>
       </w:r>
       <w:r>
-        <w:t xml:space="preserve"> Despite thousands of records, only 7 infectious-disease curves from 6 studies met the eligibility criterion: two TB cohorts (Ethiopia</w:t>
+        <w:t xml:space="preserve"> Despite 7594 records, only 7 infectious-disease curves from 6 studies qualified: two TB cohorts (Ethiopia</w:t>
       </w:r>
       <w:r>
         <w:rPr>
@@ -127,7 +127,7 @@
         <w:t>6</w:t>
       </w:r>
       <w:r>
-        <w:t>, Maputo After- and Before-Test-and-Treat</w:t>
+        <w:t>, Maputo</w:t>
       </w:r>
       <w:r>
         <w:rPr>
@@ -145,7 +145,7 @@
         <w:t>8</w:t>
       </w:r>
       <w:r>
-        <w:t>, Gambella youth</w:t>
+        <w:t>, Gambella</w:t>
       </w:r>
       <w:r>
         <w:rPr>
@@ -154,7 +154,7 @@
         <w:t>9</w:t>
       </w:r>
       <w:r>
-        <w:t xml:space="preserve">); the vast majority reported only a final proportion. Among the 7 eligible curves the shape parameter ranged from k=0.44 to k=1.86 (4 IFR, 3 DFR), and heterogeneity appeared </w:t>
+        <w:t xml:space="preserve">); most reported only a final proportion. The shape parameter ranged k=0.44–1.86 (4 IFR, 3 DFR) and diverged </w:t>
       </w:r>
       <w:r>
         <w:rPr>
@@ -163,7 +163,7 @@
         <w:t>within</w:t>
       </w:r>
       <w:r>
-        <w:t xml:space="preserve"> as well as between diseases: the two TB cohorts fell on opposite sides of k=1 (Ethiopia k=1.68 (95% CI 1.29–1.95), IFR; China k=0.44 (95% CI 0.43–0.50), DFR), and the HIV/ART cohorts likewise split (Maputo k=1.39 (95% CI 1.34–1.46) and k=1.34 (95% CI 1.29–1.41), Gambella k=1.86 (95% CI 1.73–2.18) increasing-hazard; Ethiopia-ART k=0.63 (95% CI 0.54–0.73) and Malawi k=0.78 (95% CI 0.64–0.91) decreasing-hazard). A non-infectious antipsychotic time-to-discontinuation curve</w:t>
+        <w:t xml:space="preserve"> diseases: the two TB cohorts fell on opposite sides of k=1, and the HIV/ART cohorts likewise split. A non-infectious antipsychotic contrast</w:t>
       </w:r>
       <w:r>
         <w:rPr>
@@ -172,7 +172,7 @@
         <w:t>10</w:t>
       </w:r>
       <w:r>
-        <w:t xml:space="preserve"> shown for contrast was also DFR (k=0.49 (95% CI 0.42–0.57)).</w:t>
+        <w:t xml:space="preserve"> was also DFR.</w:t>
       </w:r>
     </w:p>
     <w:p>
@@ -186,7 +186,7 @@
         <w:t>Conclusions</w:t>
       </w:r>
       <w:r>
-        <w:t xml:space="preserve"> Reproducibly usable, time-resolved dropout curves are scarce, and where they exist the hazard shape is heterogeneous within TB and within HIV alike. The timing of retention support therefore cannot be assumed from the disease label or from intuition — it must be located empirically from each setting's dropout hazard shape, which also makes an intervention's effect verifiable. The core barrier is a reporting gap: routine publication of time-to-LTFU curves (or individual patient data) is needed before disease- or setting-specific dropout patterns, and the interventions timed to them, can be established and tested.</w:t>
+        <w:t xml:space="preserve"> Reproducibly usable, time-resolved dropout curves are scarce, and where they exist the hazard shape is heterogeneous within TB and within HIV alike. Support timing therefore cannot be assumed from the disease label but must be located empirically, which also makes an intervention's effect verifiable. The core barrier is a reporting gap: time-to-LTFU curves or individual patient data must be published routinely.</w:t>
       </w:r>
     </w:p>
     <w:p>
@@ -200,7 +200,7 @@
         <w:t>Keywords</w:t>
       </w:r>
       <w:r>
-        <w:t xml:space="preserve"> Tuberculosis; HIV; Loss to follow-up; Retention in care; Scoping review; Treatment adherence; Weibull; Hazard function; Survival analysis; Reporting</w:t>
+        <w:t xml:space="preserve"> Tuberculosis; HIV; Loss to follow-up; Retention in care; Scoping search; Treatment adherence; Weibull; Hazard function; Survival analysis; Reporting</w:t>
       </w:r>
     </w:p>
     <w:p>

</xml_diff>

<commit_message>
Discussion: add equity/data-scarcity point (TB curves only from China & Ethiopia; need multi-region reporting)
Co-Authored-By: Tatsuki Onishi <bougtoir@gmail.com>
</commit_message>
<xml_diff>
--- a/weibull-clinical-dropout/reanalysis_real/manuscript/tb_dropout_heterogeneity_short_communication.docx
+++ b/weibull-clinical-dropout/reanalysis_real/manuscript/tb_dropout_heterogeneity_short_communication.docx
@@ -1052,6 +1052,23 @@
       </w:r>
     </w:p>
     <w:p>
+      <w:pPr>
+        <w:spacing w:before="120"/>
+      </w:pPr>
+      <w:r>
+        <w:t>Finally, this scarcity has an equity dimension that is central to the message of this study. Sustainable care in settings with constrained health resources and limited access depends on planning retention support and then verifying that it works; both require the timing of dropout to be recorded and reported, not just its final total. Yet despite the very large global burden of tuberculosis</w:t>
+      </w:r>
+      <w:r>
+        <w:rPr>
+          <w:vertAlign w:val="superscript"/>
+        </w:rPr>
+        <w:t>1</w:t>
+      </w:r>
+      <w:r>
+        <w:t>, we could recover a reproducibly usable time-to-LTFU curve for only 2 TB cohorts — from China and Ethiopia — with no such curve available (or openly published) for the many other high-incidence settings, which differ in health system, case mix and programme context. A hazard shape measured in one country cannot simply be transplanted to another, so the near-absence of comparable curves elsewhere means most programmes currently have no local basis on which to time support or to test whether an intervention worked. Building and openly sharing time-resolved dropout data across many more regions — for TB and for HIV alike — is therefore not merely a research convenience but a prerequisite for evidence-based, sustainable retention care where the need is greatest.</w:t>
+      </w:r>
+    </w:p>
+    <w:p>
       <w:r>
         <w:rPr>
           <w:b/>

</xml_diff>

<commit_message>
Clarify Maputo contributes 2 curves (7 curves from 6 studies)
Co-Authored-By: Tatsuki Onishi <bougtoir@gmail.com>
</commit_message>
<xml_diff>
--- a/weibull-clinical-dropout/reanalysis_real/manuscript/tb_dropout_heterogeneity_short_communication.docx
+++ b/weibull-clinical-dropout/reanalysis_real/manuscript/tb_dropout_heterogeneity_short_communication.docx
@@ -118,7 +118,7 @@
         <w:t>5</w:t>
       </w:r>
       <w:r>
-        <w:t>) and five HIV/ART cohorts (Ethiopia</w:t>
+        <w:t>) and five HIV/ART curves (Ethiopia</w:t>
       </w:r>
       <w:r>
         <w:rPr>
@@ -127,7 +127,7 @@
         <w:t>6</w:t>
       </w:r>
       <w:r>
-        <w:t>, Maputo</w:t>
+        <w:t>, Maputo (2 curves)</w:t>
       </w:r>
       <w:r>
         <w:rPr>
@@ -375,7 +375,7 @@
         <w:t>Yield of the search.</w:t>
       </w:r>
       <w:r>
-        <w:t xml:space="preserve"> Although the search identified 7594 open-access records, reproducibly digitizable, time-resolved dropout curves were rare: only 7 infectious-disease curves from 6 studies met the eligibility criterion (two TB, five HIV/ART). The dominant reason for ineligibility was that reports gave only a final cumulative LTFU proportion, with no curve from which the timing of dropout could be recovered. This scarcity is itself a principal finding: the data needed to time retention support are, at present, seldom published in a usable form.</w:t>
+        <w:t xml:space="preserve"> Although the search identified 7594 open-access records, reproducibly digitizable, time-resolved dropout curves were rare: only 7 infectious-disease curves from 6 studies met the eligibility criterion (two TB and five HIV/ART curves; the 7 curves exceed the 6 studies because the Maputo study contributed two curves, its After- and Before-Test-and-Treat cohorts). The dominant reason for ineligibility was that reports gave only a final cumulative LTFU proportion, with no curve from which the timing of dropout could be recovered. This scarcity is itself a principal finding: the data needed to time retention support are, at present, seldom published in a usable form.</w:t>
       </w:r>
     </w:p>
     <w:p>

</xml_diff>

<commit_message>
Remove numbered citations from abstract (standard practice); citations now start in body, order preserved
Co-Authored-By: Tatsuki Onishi <bougtoir@gmail.com>
</commit_message>
<xml_diff>
--- a/weibull-clinical-dropout/reanalysis_real/manuscript/tb_dropout_heterogeneity_short_communication.docx
+++ b/weibull-clinical-dropout/reanalysis_real/manuscript/tb_dropout_heterogeneity_short_communication.docx
@@ -45,34 +45,7 @@
         <w:t>Objectives</w:t>
       </w:r>
       <w:r>
-        <w:t xml:space="preserve"> Loss to follow-up (LTFU) undermines tuberculosis (TB) and HIV treatment</w:t>
-      </w:r>
-      <w:r>
-        <w:rPr>
-          <w:vertAlign w:val="superscript"/>
-        </w:rPr>
-        <w:t>1</w:t>
-      </w:r>
-      <w:r>
-        <w:t>; its determinants are context-dependent</w:t>
-      </w:r>
-      <w:r>
-        <w:rPr>
-          <w:vertAlign w:val="superscript"/>
-        </w:rPr>
-        <w:t>2</w:t>
-      </w:r>
-      <w:r>
-        <w:t xml:space="preserve"> and retention interventions inconsistent</w:t>
-      </w:r>
-      <w:r>
-        <w:rPr>
-          <w:vertAlign w:val="superscript"/>
-        </w:rPr>
-        <w:t>3</w:t>
-      </w:r>
-      <w:r>
-        <w:t>, yet support is rarely targeted to *when* patients disengage. We asked how often dropout timing (the hazard shape) is reported reproducibly and whether it is consistent within and across diseases.</w:t>
+        <w:t xml:space="preserve"> Loss to follow-up (LTFU) undermines tuberculosis (TB) and HIV treatment; its determinants are context-dependent and retention interventions inconsistent, yet support is rarely targeted to *when* patients disengage. We asked how often dropout timing (the hazard shape) is reported reproducibly and whether it is consistent within and across diseases.</w:t>
       </w:r>
     </w:p>
     <w:p>
@@ -100,61 +73,7 @@
         <w:t>Results</w:t>
       </w:r>
       <w:r>
-        <w:t xml:space="preserve"> Despite 7594 records, only 7 infectious-disease curves from 6 studies qualified: two TB cohorts (Ethiopia</w:t>
-      </w:r>
-      <w:r>
-        <w:rPr>
-          <w:vertAlign w:val="superscript"/>
-        </w:rPr>
-        <w:t>4</w:t>
-      </w:r>
-      <w:r>
-        <w:t>, China</w:t>
-      </w:r>
-      <w:r>
-        <w:rPr>
-          <w:vertAlign w:val="superscript"/>
-        </w:rPr>
-        <w:t>5</w:t>
-      </w:r>
-      <w:r>
-        <w:t>) and five HIV/ART curves (Ethiopia</w:t>
-      </w:r>
-      <w:r>
-        <w:rPr>
-          <w:vertAlign w:val="superscript"/>
-        </w:rPr>
-        <w:t>6</w:t>
-      </w:r>
-      <w:r>
-        <w:t>, Maputo (2 curves)</w:t>
-      </w:r>
-      <w:r>
-        <w:rPr>
-          <w:vertAlign w:val="superscript"/>
-        </w:rPr>
-        <w:t>7</w:t>
-      </w:r>
-      <w:r>
-        <w:t>, Malawi</w:t>
-      </w:r>
-      <w:r>
-        <w:rPr>
-          <w:vertAlign w:val="superscript"/>
-        </w:rPr>
-        <w:t>8</w:t>
-      </w:r>
-      <w:r>
-        <w:t>, Gambella</w:t>
-      </w:r>
-      <w:r>
-        <w:rPr>
-          <w:vertAlign w:val="superscript"/>
-        </w:rPr>
-        <w:t>9</w:t>
-      </w:r>
-      <w:r>
-        <w:t xml:space="preserve">); most reported only a final proportion. The shape parameter ranged k=0.44–1.86 (4 IFR, 3 DFR) and diverged </w:t>
+        <w:t xml:space="preserve"> Despite 7594 records, only 7 infectious-disease curves from 6 studies qualified: two TB cohorts (Ethiopia, China) and five HIV/ART curves (Ethiopia, Maputo [2 curves], Malawi, Gambella); most reported only a final proportion. The shape parameter ranged k=0.44–1.86 (4 IFR, 3 DFR) and diverged </w:t>
       </w:r>
       <w:r>
         <w:rPr>
@@ -163,16 +82,7 @@
         <w:t>within</w:t>
       </w:r>
       <w:r>
-        <w:t xml:space="preserve"> diseases: the two TB cohorts fell on opposite sides of k=1, and the HIV/ART cohorts likewise split. A non-infectious antipsychotic contrast</w:t>
-      </w:r>
-      <w:r>
-        <w:rPr>
-          <w:vertAlign w:val="superscript"/>
-        </w:rPr>
-        <w:t>10</w:t>
-      </w:r>
-      <w:r>
-        <w:t xml:space="preserve"> was also DFR.</w:t>
+        <w:t xml:space="preserve"> diseases: the two TB cohorts fell on opposite sides of k=1, and the HIV/ART cohorts likewise split. A non-infectious antipsychotic contrast was also DFR.</w:t>
       </w:r>
     </w:p>
     <w:p>

</xml_diff>

<commit_message>
Add central clinical question to abstract/intro; restructure Discussion to answer it from results first; define CI/AIC in body
Co-Authored-By: Tatsuki Onishi <bougtoir@gmail.com>
</commit_message>
<xml_diff>
--- a/weibull-clinical-dropout/reanalysis_real/manuscript/tb_dropout_heterogeneity_short_communication.docx
+++ b/weibull-clinical-dropout/reanalysis_real/manuscript/tb_dropout_heterogeneity_short_communication.docx
@@ -45,7 +45,7 @@
         <w:t>Objectives</w:t>
       </w:r>
       <w:r>
-        <w:t xml:space="preserve"> Loss to follow-up (LTFU) undermines tuberculosis (TB) and HIV treatment; its determinants are context-dependent and retention interventions inconsistent, yet support is rarely targeted to *when* patients disengage. We asked how often dropout timing (the hazard shape) is reported reproducibly and whether it is consistent within and across diseases.</w:t>
+        <w:t xml:space="preserve"> Loss to follow-up (LTFU) undermines tuberculosis (TB) and HIV treatment, yet support is rarely targeted to *when* patients disengage. The clinical question is whether dropout is homogeneous enough for its timing to be inferred from the diagnosis. We asked whether the hazard shape is consistent within and across diseases, and how often it is reported in a reproducibly usable form.</w:t>
       </w:r>
     </w:p>
     <w:p>
@@ -59,7 +59,7 @@
         <w:t>Methods</w:t>
       </w:r>
       <w:r>
-        <w:t xml:space="preserve"> A reproducible Europe PMC search (open-access TB/HIV reports mentioning a time-to-event curve; 7594 records, 2026-07-17) required a single, digitizable dropout curve (Kaplan–Meier or competing-risk cumulative incidence), not a final proportion. Eligible curves were digitized and fitted with a Weibull model F(t)=1−exp(−(t/λ)^k); the shape k (k&gt;1 increasing-failure-rate [IFR]; k&lt;1 decreasing-failure-rate [DFR]) was bootstrapped (95% confidence interval [CI]) and compared with exponential and log-normal fits by the Akaike information criterion (AIC).</w:t>
+        <w:t xml:space="preserve"> A reproducible Europe PMC search (open-access TB/HIV reports mentioning a time-to-event curve; 7594 records, 2026-07-17) required a single, digitizable dropout curve (Kaplan–Meier or competing-risk cumulative incidence), not a final proportion. Eligible curves were digitized and fitted with a Weibull model F(t)=1−exp(−(t/λ)^k); the shape k (k&gt;1 increasing-failure-rate [IFR]; k&lt;1 decreasing-failure-rate [DFR]) was bootstrapped and compared with exponential and log-normal fits by the Akaike information criterion (AIC).</w:t>
       </w:r>
     </w:p>
     <w:p>
@@ -82,7 +82,7 @@
         <w:t>within</w:t>
       </w:r>
       <w:r>
-        <w:t xml:space="preserve"> diseases: the two TB cohorts fell on opposite sides of k=1, and the HIV/ART cohorts likewise split. A non-infectious antipsychotic contrast was also DFR.</w:t>
+        <w:t xml:space="preserve"> diseases: the two TB cohorts fell on opposite sides of k=1, and the HIV/ART cohorts likewise split.</w:t>
       </w:r>
     </w:p>
     <w:p>
@@ -96,7 +96,7 @@
         <w:t>Conclusions</w:t>
       </w:r>
       <w:r>
-        <w:t xml:space="preserve"> Reproducibly usable, time-resolved dropout curves are scarce, and where they exist the hazard shape is heterogeneous within TB and within HIV alike. Support timing therefore cannot be assumed from the disease label but must be located empirically, which also makes an intervention's effect verifiable. The core barrier is a reporting gap: time-to-LTFU curves or individual patient data must be published routinely.</w:t>
+        <w:t xml:space="preserve"> Reproducibly usable, time-resolved dropout curves are scarce, and where they exist the hazard shape is heterogeneous within both TB and HIV. Support timing therefore cannot be assumed from the disease label but must be located empirically, which also makes an intervention's effect verifiable. The core barrier is a reporting gap: time-to-LTFU curves or individual patient data must be published routinely.</w:t>
       </w:r>
     </w:p>
     <w:p>
@@ -162,7 +162,7 @@
         <w:spacing w:before="120"/>
       </w:pPr>
       <w:r>
-        <w:t>What has been missing is a *quantitative* description of the phenomenon that plausibly underlies this: whether patients across settings even disengage on the same time-course. Programmatic reports usually give a single cumulative LTFU proportion, which hides *when* during treatment patients leave. The hazard shape carries direct operational meaning: an increasing hazard (k&gt;1) argues for intensified support later in treatment, a decreasing hazard (k&lt;1) for front-loading it in the earliest weeks. Making, and later verifying, such timing decisions requires the shape to be recoverable from the published evidence in the first place. We therefore treated this as a scoping question with a deliberately unusual eligibility criterion — that a study make dropout *visible over time* in a reproducibly digitizable curve, not merely as a final proportion — and asked two things: how often is dropout timing reported in that usable form, and, where it is, is the Weibull hazard shape consistent within a disease and between diseases? To our knowledge no prior review has used reproducible visualization of dropout timing as its inclusion criterion.</w:t>
+        <w:t>What has been missing is a *quantitative* description of the phenomenon that plausibly underlies this: whether patients across settings even disengage on the same time-course. Programmatic reports usually give a single cumulative LTFU proportion, which hides *when* during treatment patients leave. This raises the clinical question at the centre of this study: is dropout homogeneous enough that the timing of retention support can be inferred from the diagnosis, or must the hazard shape be measured in each setting? The hazard shape carries direct operational meaning: an increasing hazard (k&gt;1) argues for intensified support later in treatment, a decreasing hazard (k&lt;1) for front-loading it in the earliest weeks. Making, and later verifying, such timing decisions requires the shape to be recoverable from the published evidence in the first place. We therefore treated this as a scoping question with a deliberately unusual eligibility criterion — that a study make dropout *visible over time* in a reproducibly digitizable curve, not merely as a final proportion — and asked two things: how often is dropout timing reported in that usable form, and, where it is, is the Weibull hazard shape consistent within a disease and between diseases? To our knowledge no prior review has used reproducible visualization of dropout timing as its inclusion criterion.</w:t>
       </w:r>
     </w:p>
     <w:p>
@@ -262,7 +262,7 @@
         <w:t>10</w:t>
       </w:r>
       <w:r>
-        <w:t>. Curves were digitized from the published figures by an in-house pixel extractor with axis calibration read from the figure tick marks (values taken from curve pixels, not entered by hand); the original figure images and digitized coordinates are in the public repository. For each dataset we fitted the Weibull cumulative-incidence model F(t)=1−exp(−(t/λ)^k) by nonlinear least squares, obtained a bootstrap 95% CI for k, and compared the fit with exponential (k=1) and log-normal models by AIC. The shape parameter k is unit-free, so mixed follow-up units (months, days) do not affect the cross-study comparison of shape. Data, code and a one-command build that regenerates every reported number, Table 1 and Figure 1 are openly available (Availability of data and materials); no value is hard-coded.</w:t>
+        <w:t>. Curves were digitized from the published figures by an in-house pixel extractor with axis calibration read from the figure tick marks (values taken from curve pixels, not entered by hand); the original figure images and digitized coordinates are in the public repository. For each dataset we fitted the Weibull cumulative-incidence model F(t)=1−exp(−(t/λ)^k) by nonlinear least squares, obtained a bootstrap 95% confidence interval (CI) for k, and compared the fit with exponential (k=1) and log-normal models by the Akaike information criterion (AIC). The shape parameter k is unit-free, so mixed follow-up units (months, days) do not affect the cross-study comparison of shape. Data, code and a one-command build that regenerates every reported number, Table 1 and Figure 1 are openly available (Availability of data and materials); no value is hard-coded.</w:t>
       </w:r>
     </w:p>
     <w:p>
@@ -888,7 +888,7 @@
         <w:spacing w:before="120"/>
       </w:pPr>
       <w:r>
-        <w:t>The analysis puts a number on an accepted but qualitative problem and turns it in a practical direction. It is already known that treatment-interruption determinants are context-dependent</w:t>
+        <w:t>The clinical question posed at the outset was whether dropout is homogeneous enough for the timing of retention support to be inferred from the diagnosis. Our results answer it in the negative. Across the eligible curves the Weibull hazard shape was heterogeneous not only between diseases but within them: both the two TB cohorts and the HIV/ART cohorts fell on opposite sides of k=1, so there was no characteristic ‘TB shape’ or ‘HIV shape’ and the direction of the dropout hazard varied from cohort to cohort within the same disease. Dropout is therefore not homogeneous enough to read the timing of support off the diagnostic label: retention is not simply a matter of exhorting patients to try harder, and *when* to strengthen support cannot be assumed from the diagnosis. This gives a concrete, quantitative mechanism for the already-established observations that treatment-interruption determinants are context-dependent</w:t>
       </w:r>
       <w:r>
         <w:rPr>
@@ -906,16 +906,15 @@
         <w:t>3</w:t>
       </w:r>
       <w:r>
-        <w:t xml:space="preserve">; our contribution is to show that this heterogeneity is visible in the </w:t>
+        <w:t>.</w:t>
       </w:r>
+    </w:p>
+    <w:p>
+      <w:pPr>
+        <w:spacing w:before="120"/>
+      </w:pPr>
       <w:r>
-        <w:rPr>
-          <w:b/>
-        </w:rPr>
-        <w:t>hazard shape itself</w:t>
-      </w:r>
-      <w:r>
-        <w:t xml:space="preserve"> and, importantly, that it is not confined to a single disease. Both the two TB cohorts and the HIV/ART cohorts fell on opposite sides of k=1, so there was no characteristic ‘TB shape’ or ‘HIV shape’: the direction of the dropout hazard varied from cohort to cohort within the same disease. The direct implication is that retention is not a matter of exhorting patients to try harder, and the timing of support cannot be read off the diagnosis. Because the hazard shape encodes *when* patients disengage, it maps onto the timing of adherence support: a front-loaded (DFR) setting argues for concentrating counselling, financial or social support in the earliest weeks, whereas a late-accelerating (IFR) setting argues for sustained or intensified support later in treatment. A package optimized for one shape will be mistimed in the other — a concrete, quantitative reason why globally standardized adherence interventions have shown inconsistent effects</w:t>
+        <w:t>The practical consequence follows directly. Because the hazard shape encodes *when* patients disengage, it maps onto the timing of adherence support: a front-loaded (DFR) setting argues for concentrating counselling, financial or social support in the earliest weeks, whereas a late-accelerating (IFR) setting argues for sustained or intensified support later in treatment. A package optimized for one shape will be mistimed in the other — a concrete reason why globally standardized adherence interventions have shown inconsistent effects</w:t>
       </w:r>
       <w:r>
         <w:rPr>
@@ -924,7 +923,7 @@
         <w:t>3</w:t>
       </w:r>
       <w:r>
-        <w:t>.</w:t>
+        <w:t>. This reframes retention design as a measurement problem before it is an intervention problem: choosing a support package because it seems sensible, without first locating a setting's dropout hazard shape, risks both mistiming the support and losing the ability to tell whether it worked, because an effect concentrated in the wrong phase of treatment can be invisible against the actual dropout dynamics. Estimating the shape first gives a pre-specified, falsifiable target — shift the hazard at the phase where dropout concentrates — against which an intervention can be evaluated; the Weibull cumulative-incidence model used here is a compact, reproducible way to obtain that shape from a single published curve.</w:t>
       </w:r>
     </w:p>
     <w:p>
@@ -932,15 +931,7 @@
         <w:spacing w:before="120"/>
       </w:pPr>
       <w:r>
-        <w:t>This reframes retention design as a measurement problem before it is an intervention problem. Choosing a support package because it seems sensible, without first locating a setting's dropout hazard shape, risks both mistiming the support and losing the ability to tell whether it worked: an effect concentrated in the wrong phase of treatment can be invisible against the actual dropout dynamics. Estimating the shape first gives a pre-specified, falsifiable target — shift the hazard at the phase where dropout concentrates — against which an intervention can be evaluated. The Weibull cumulative-incidence model used here is a compact and reproducible way to obtain that shape from a single published curve.</w:t>
-      </w:r>
-    </w:p>
-    <w:p>
-      <w:pPr>
-        <w:spacing w:before="120"/>
-      </w:pPr>
-      <w:r>
-        <w:t>We cannot explain why the shapes diverge, and we do not claim to. The divergence is confounded with different outcome definitions (competing-risk cumulative incidence vs all-patient KM), case mix, programme context and unequal observation windows, and it rests on digitized aggregate curves rather than individual patient data. One candidate worth stating explicitly is the age structure of disease onset: TB in China is increasingly concentrated in the elderly</w:t>
+        <w:t>Beyond answering the question, why the shapes diverge is worth considering even though it lies beyond what these data can establish. We cannot explain the divergence, and we do not claim to. It is confounded with different outcome definitions (competing-risk cumulative incidence vs all-patient KM), case mix, programme context and unequal observation windows, and it rests on digitized aggregate curves rather than individual patient data. One candidate worth stating explicitly is the age structure of disease onset: TB in China is increasingly concentrated in the elderly</w:t>
       </w:r>
       <w:r>
         <w:rPr>

</xml_diff>